<commit_message>
Rigenera MANUALE_OPERATORE e MANUALE_UTENTE con TOC linkato alle pagine
Entrambi i manuali rigenerati con processo a due passi:
1. genera placeholder docx
2. rendi PDF, estrai numeri di pagina con pdftotext -layout
3. rigenera con TOC statico (bookmark + hyperlink + leader dots)

MANUALE_OPERATORE: 21 bookmark, 20 hyperlink cliccabili (l'Indice
non si auto-linka). 11 sezioni: Cos'è / Primo accesso / Operazioni
quotidiane / Le 3 regole d'oro / Cosa fare se ho fatto un casino /
FAQ / Contatti.

MANUALE_UTENTE: 37 bookmark, 36 hyperlink cliccabili. 11 sezioni:
Cos'è / Come accedere / Primo utilizzo / Caricare il listino /
Cercare e filtrare / Costruire un preventivo / Esportare /
Promozioni / Pulizia e gestione dati / FAQ.

Validazione XML: zero TOC field residui, zero fldChar Aggiorna/F9
placeholder. I link funzionano nativamente dentro Word, LibreOffice,
Pages e nei PDF risultanti dall'export.

Co-Authored-By: Claude Opus 4.7 (1M context) <noreply@anthropic.com>
</commit_message>
<xml_diff>
--- a/MANUALE_UTENTE.docx
+++ b/MANUALE_UTENTE.docx
@@ -159,7 +159,7 @@
             <w:color w:val="0563C1"/>
             <w:u w:val="single"/>
           </w:rPr>
-          <w:t xml:space="preserve">4</w:t>
+          <w:t xml:space="preserve">3</w:t>
         </w:r>
       </w:hyperlink>
     </w:p>
@@ -197,7 +197,7 @@
             <w:color w:val="0563C1"/>
             <w:u w:val="single"/>
           </w:rPr>
-          <w:t xml:space="preserve">4</w:t>
+          <w:t xml:space="preserve">3</w:t>
         </w:r>
       </w:hyperlink>
     </w:p>
@@ -235,7 +235,7 @@
             <w:color w:val="0563C1"/>
             <w:u w:val="single"/>
           </w:rPr>
-          <w:t xml:space="preserve">4</w:t>
+          <w:t xml:space="preserve">3</w:t>
         </w:r>
       </w:hyperlink>
     </w:p>
@@ -274,7 +274,7 @@
             <w:color w:val="0563C1"/>
             <w:u w:val="single"/>
           </w:rPr>
-          <w:t xml:space="preserve">5</w:t>
+          <w:t xml:space="preserve">4</w:t>
         </w:r>
       </w:hyperlink>
     </w:p>
@@ -312,7 +312,7 @@
             <w:color w:val="0563C1"/>
             <w:u w:val="single"/>
           </w:rPr>
-          <w:t xml:space="preserve">5</w:t>
+          <w:t xml:space="preserve">4</w:t>
         </w:r>
       </w:hyperlink>
     </w:p>
@@ -350,7 +350,7 @@
             <w:color w:val="0563C1"/>
             <w:u w:val="single"/>
           </w:rPr>
-          <w:t xml:space="preserve">5</w:t>
+          <w:t xml:space="preserve">4</w:t>
         </w:r>
       </w:hyperlink>
     </w:p>
@@ -388,7 +388,7 @@
             <w:color w:val="0563C1"/>
             <w:u w:val="single"/>
           </w:rPr>
-          <w:t xml:space="preserve">5</w:t>
+          <w:t xml:space="preserve">4</w:t>
         </w:r>
       </w:hyperlink>
     </w:p>
@@ -427,7 +427,7 @@
             <w:color w:val="0563C1"/>
             <w:u w:val="single"/>
           </w:rPr>
-          <w:t xml:space="preserve">7</w:t>
+          <w:t xml:space="preserve">6</w:t>
         </w:r>
       </w:hyperlink>
     </w:p>
@@ -466,7 +466,7 @@
             <w:color w:val="0563C1"/>
             <w:u w:val="single"/>
           </w:rPr>
-          <w:t xml:space="preserve">8</w:t>
+          <w:t xml:space="preserve">7</w:t>
         </w:r>
       </w:hyperlink>
     </w:p>
@@ -504,7 +504,7 @@
             <w:color w:val="0563C1"/>
             <w:u w:val="single"/>
           </w:rPr>
-          <w:t xml:space="preserve">8</w:t>
+          <w:t xml:space="preserve">7</w:t>
         </w:r>
       </w:hyperlink>
     </w:p>
@@ -542,7 +542,7 @@
             <w:color w:val="0563C1"/>
             <w:u w:val="single"/>
           </w:rPr>
-          <w:t xml:space="preserve">8</w:t>
+          <w:t xml:space="preserve">7</w:t>
         </w:r>
       </w:hyperlink>
     </w:p>
@@ -580,7 +580,7 @@
             <w:color w:val="0563C1"/>
             <w:u w:val="single"/>
           </w:rPr>
-          <w:t xml:space="preserve">8</w:t>
+          <w:t xml:space="preserve">7</w:t>
         </w:r>
       </w:hyperlink>
     </w:p>
@@ -618,7 +618,7 @@
             <w:color w:val="0563C1"/>
             <w:u w:val="single"/>
           </w:rPr>
-          <w:t xml:space="preserve">9</w:t>
+          <w:t xml:space="preserve">8</w:t>
         </w:r>
       </w:hyperlink>
     </w:p>
@@ -656,7 +656,7 @@
             <w:color w:val="0563C1"/>
             <w:u w:val="single"/>
           </w:rPr>
-          <w:t xml:space="preserve">9</w:t>
+          <w:t xml:space="preserve">8</w:t>
         </w:r>
       </w:hyperlink>
     </w:p>
@@ -695,7 +695,7 @@
             <w:color w:val="0563C1"/>
             <w:u w:val="single"/>
           </w:rPr>
-          <w:t xml:space="preserve">10</w:t>
+          <w:t xml:space="preserve">9</w:t>
         </w:r>
       </w:hyperlink>
     </w:p>
@@ -733,7 +733,7 @@
             <w:color w:val="0563C1"/>
             <w:u w:val="single"/>
           </w:rPr>
-          <w:t xml:space="preserve">10</w:t>
+          <w:t xml:space="preserve">9</w:t>
         </w:r>
       </w:hyperlink>
     </w:p>
@@ -771,7 +771,7 @@
             <w:color w:val="0563C1"/>
             <w:u w:val="single"/>
           </w:rPr>
-          <w:t xml:space="preserve">10</w:t>
+          <w:t xml:space="preserve">9</w:t>
         </w:r>
       </w:hyperlink>
     </w:p>
@@ -809,7 +809,7 @@
             <w:color w:val="0563C1"/>
             <w:u w:val="single"/>
           </w:rPr>
-          <w:t xml:space="preserve">10</w:t>
+          <w:t xml:space="preserve">9</w:t>
         </w:r>
       </w:hyperlink>
     </w:p>
@@ -848,7 +848,7 @@
             <w:color w:val="0563C1"/>
             <w:u w:val="single"/>
           </w:rPr>
-          <w:t xml:space="preserve">11</w:t>
+          <w:t xml:space="preserve">10</w:t>
         </w:r>
       </w:hyperlink>
     </w:p>
@@ -886,7 +886,7 @@
             <w:color w:val="0563C1"/>
             <w:u w:val="single"/>
           </w:rPr>
-          <w:t xml:space="preserve">11</w:t>
+          <w:t xml:space="preserve">10</w:t>
         </w:r>
       </w:hyperlink>
     </w:p>
@@ -924,7 +924,7 @@
             <w:color w:val="0563C1"/>
             <w:u w:val="single"/>
           </w:rPr>
-          <w:t xml:space="preserve">11</w:t>
+          <w:t xml:space="preserve">10</w:t>
         </w:r>
       </w:hyperlink>
     </w:p>
@@ -962,7 +962,7 @@
             <w:color w:val="0563C1"/>
             <w:u w:val="single"/>
           </w:rPr>
-          <w:t xml:space="preserve">11</w:t>
+          <w:t xml:space="preserve">10</w:t>
         </w:r>
       </w:hyperlink>
     </w:p>
@@ -1000,7 +1000,7 @@
             <w:color w:val="0563C1"/>
             <w:u w:val="single"/>
           </w:rPr>
-          <w:t xml:space="preserve">12</w:t>
+          <w:t xml:space="preserve">11</w:t>
         </w:r>
       </w:hyperlink>
     </w:p>
@@ -1039,7 +1039,7 @@
             <w:color w:val="0563C1"/>
             <w:u w:val="single"/>
           </w:rPr>
-          <w:t xml:space="preserve">13</w:t>
+          <w:t xml:space="preserve">12</w:t>
         </w:r>
       </w:hyperlink>
     </w:p>
@@ -1077,7 +1077,7 @@
             <w:color w:val="0563C1"/>
             <w:u w:val="single"/>
           </w:rPr>
-          <w:t xml:space="preserve">13</w:t>
+          <w:t xml:space="preserve">12</w:t>
         </w:r>
       </w:hyperlink>
     </w:p>
@@ -1115,7 +1115,7 @@
             <w:color w:val="0563C1"/>
             <w:u w:val="single"/>
           </w:rPr>
-          <w:t xml:space="preserve">13</w:t>
+          <w:t xml:space="preserve">12</w:t>
         </w:r>
       </w:hyperlink>
     </w:p>
@@ -1153,7 +1153,7 @@
             <w:color w:val="0563C1"/>
             <w:u w:val="single"/>
           </w:rPr>
-          <w:t xml:space="preserve">13</w:t>
+          <w:t xml:space="preserve">12</w:t>
         </w:r>
       </w:hyperlink>
     </w:p>
@@ -1192,7 +1192,7 @@
             <w:color w:val="0563C1"/>
             <w:u w:val="single"/>
           </w:rPr>
-          <w:t xml:space="preserve">15</w:t>
+          <w:t xml:space="preserve">14</w:t>
         </w:r>
       </w:hyperlink>
     </w:p>
@@ -1230,7 +1230,7 @@
             <w:color w:val="0563C1"/>
             <w:u w:val="single"/>
           </w:rPr>
-          <w:t xml:space="preserve">15</w:t>
+          <w:t xml:space="preserve">14</w:t>
         </w:r>
       </w:hyperlink>
     </w:p>
@@ -1268,7 +1268,7 @@
             <w:color w:val="0563C1"/>
             <w:u w:val="single"/>
           </w:rPr>
-          <w:t xml:space="preserve">15</w:t>
+          <w:t xml:space="preserve">14</w:t>
         </w:r>
       </w:hyperlink>
     </w:p>
@@ -1306,7 +1306,7 @@
             <w:color w:val="0563C1"/>
             <w:u w:val="single"/>
           </w:rPr>
-          <w:t xml:space="preserve">15</w:t>
+          <w:t xml:space="preserve">14</w:t>
         </w:r>
       </w:hyperlink>
     </w:p>
@@ -1344,7 +1344,7 @@
             <w:color w:val="0563C1"/>
             <w:u w:val="single"/>
           </w:rPr>
-          <w:t xml:space="preserve">16</w:t>
+          <w:t xml:space="preserve">15</w:t>
         </w:r>
       </w:hyperlink>
     </w:p>
@@ -1383,7 +1383,7 @@
             <w:color w:val="0563C1"/>
             <w:u w:val="single"/>
           </w:rPr>
-          <w:t xml:space="preserve">17</w:t>
+          <w:t xml:space="preserve">16</w:t>
         </w:r>
       </w:hyperlink>
     </w:p>
@@ -1421,7 +1421,7 @@
             <w:color w:val="0563C1"/>
             <w:u w:val="single"/>
           </w:rPr>
-          <w:t xml:space="preserve">17</w:t>
+          <w:t xml:space="preserve">16</w:t>
         </w:r>
       </w:hyperlink>
     </w:p>
@@ -1459,7 +1459,7 @@
             <w:color w:val="0563C1"/>
             <w:u w:val="single"/>
           </w:rPr>
-          <w:t xml:space="preserve">17</w:t>
+          <w:t xml:space="preserve">16</w:t>
         </w:r>
       </w:hyperlink>
     </w:p>
@@ -1498,7 +1498,7 @@
             <w:color w:val="0563C1"/>
             <w:u w:val="single"/>
           </w:rPr>
-          <w:t xml:space="preserve">19</w:t>
+          <w:t xml:space="preserve">18</w:t>
         </w:r>
       </w:hyperlink>
     </w:p>

</xml_diff>